<commit_message>
Actualizar Manual de canjes marketing, un solo boton para consulta de clientes vip de EMITA
</commit_message>
<xml_diff>
--- a/docs/manual-canjes-marketing/Manual_Usuario_AnitaERP_Canjes_Marketing.docx
+++ b/docs/manual-canjes-marketing/Manual_Usuario_AnitaERP_Canjes_Marketing.docx
@@ -60,7 +60,7 @@
           <w:sz w:val="22"/>
           <w:szCs w:val="22"/>
         </w:rPr>
-        <w:t xml:space="preserve">Versión 1.1 — octubre 2026</w:t>
+        <w:t xml:space="preserve">Versión 1.3 — octubre 2026</w:t>
       </w:r>
     </w:p>
     <w:p>
@@ -114,7 +114,7 @@
           <w:sz w:val="22"/>
           <w:szCs w:val="22"/>
         </w:rPr>
-        <w:t xml:space="preserve">En el menú se entra por Ventas, después Gastronomía, después Canjes. Ahí hay cinco pantallas. Las tres de siempre son Clientes VIP, Facturador canjes marketing y Listado canjes marketing. Las dos nuevas consultan la base de Emita: VIP Emita por nombre y VIP Emita por alias.</w:t>
+        <w:t xml:space="preserve">En el menú se entra por Ventas, después Gastronomía, después Canjes. Ahí están Clientes VIP, Facturador canjes marketing, Listado canjes marketing y Consulta VIP Emita.</w:t>
       </w:r>
     </w:p>
     <w:p>
@@ -175,7 +175,7 @@
       </w:pPr>
       <w:r>
         <w:rPr/>
-        <w:t xml:space="preserve">VIP Emita por nombre y VIP Emita por alias: consultas a Emita para encontrar a un cliente de la sala aunque todavía no esté en la lista de Anita.</w:t>
+        <w:t xml:space="preserve">Consulta VIP Emita: un solo botón. El mismo texto se busca a la vez en el nombre y en el alias, para encontrar a un cliente de la sala aunque todavía no esté en la lista de Anita.</w:t>
       </w:r>
     </w:p>
     <w:p>
@@ -993,7 +993,7 @@
           <w:sz w:val="22"/>
           <w:szCs w:val="22"/>
         </w:rPr>
-        <w:t xml:space="preserve">Úsela cuando ya conoce a la persona y quiere verla, corregir un dato o darla de alta a mano. Si la persona está en la sala pero todavía no está en esta lista, búsquela en VIP Emita por nombre o por alias (capítulos 8 y 9).</w:t>
+        <w:t xml:space="preserve">Úsela cuando ya conoce a la persona y quiere verla, corregir un dato o darla de alta a mano. Si la persona está en la sala pero todavía no está en esta lista, búsquela en Consulta VIP Emita (capítulos 8 y 9).</w:t>
       </w:r>
     </w:p>
     <w:p>
@@ -1869,6 +1869,41 @@
                 <w:sz w:val="20"/>
                 <w:szCs w:val="20"/>
               </w:rPr>
+              <w:t xml:space="preserve">Consultar Emita</w:t>
+            </w:r>
+          </w:p>
+        </w:tc>
+        <w:tc>
+          <w:tcPr>
+            <w:tcW w:w="2800" w:type="dxa"/>
+            <w:noWrap/>
+          </w:tcPr>
+          <w:p>
+            <w:pPr/>
+            <w:r>
+              <w:rPr>
+                <w:sz w:val="20"/>
+                <w:szCs w:val="20"/>
+              </w:rPr>
+              <w:t xml:space="preserve">Busca en Emita por nombre y por alias a la vez. Elegir solo si la fila tiene cuenta Wigos</w:t>
+            </w:r>
+          </w:p>
+        </w:tc>
+      </w:tr>
+      <w:tr>
+        <w:trPr/>
+        <w:tc>
+          <w:tcPr>
+            <w:tcW w:w="2800" w:type="dxa"/>
+            <w:noWrap/>
+          </w:tcPr>
+          <w:p>
+            <w:pPr/>
+            <w:r>
+              <w:rPr>
+                <w:sz w:val="20"/>
+                <w:szCs w:val="20"/>
+              </w:rPr>
               <w:t xml:space="preserve">Facturar o F8</w:t>
             </w:r>
           </w:p>
@@ -1925,7 +1960,7 @@
           <w:sz w:val="22"/>
           <w:szCs w:val="22"/>
         </w:rPr>
-        <w:t xml:space="preserve">La lupa que está al lado del nombre busca solo en la lista de Anita (Clientes VIP). No consulta Emita. Para buscar en Emita use los botones Por nombre y Por alias, explicados en el capítulo 9.</w:t>
+        <w:t xml:space="preserve">La lupa que está al lado del nombre busca solo en la lista de Anita (Clientes VIP). No consulta Emita. Para buscar en Emita use el botón Consultar Emita, explicado en el capítulo 9.</w:t>
       </w:r>
     </w:p>
     <w:p>
@@ -2201,7 +2236,7 @@
                 <w:sz w:val="20"/>
                 <w:szCs w:val="20"/>
               </w:rPr>
-              <w:t xml:space="preserve">Use Por nombre o Por alias (capítulo 9)</w:t>
+              <w:t xml:space="preserve">Use Consultar Emita (capítulo 9)</w:t>
             </w:r>
           </w:p>
         </w:tc>
@@ -2228,7 +2263,7 @@
           <w:sz w:val="22"/>
           <w:szCs w:val="22"/>
         </w:rPr>
-        <w:t xml:space="preserve">Estas dos pantallas sirven para mirar la base de Emita sin facturar. Están en el mismo menú: Ventas → Gastronomía → Canjes → VIP Emita por nombre, y VIP Emita por alias.</w:t>
+        <w:t xml:space="preserve">Esta pantalla sirve para mirar la base de Emita sin facturar. Menú: Ventas → Gastronomía → Canjes → Consulta VIP Emita. Ya no hay una entrada por nombre y otra por alias.</w:t>
       </w:r>
     </w:p>
     <w:p>
@@ -2241,7 +2276,7 @@
           <w:sz w:val="22"/>
           <w:szCs w:val="22"/>
         </w:rPr>
-        <w:t xml:space="preserve">En la esquina de cada pantalla hay un botón para pasar a la otra. No son dos búsquedas iguales: cada una muestra un grupo distinto de personas.</w:t>
+        <w:t xml:space="preserve">Hay un solo campo y un solo botón Consultar. Escriba un nombre, un apellido o un apodo: Anita lo busca en los dos lugares al mismo tiempo.</w:t>
       </w:r>
     </w:p>
     <w:p>
@@ -2376,7 +2411,7 @@
           <w:i w:val="1"/>
           <w:iCs w:val="1"/>
         </w:rPr>
-        <w:t xml:space="preserve">Cuándo usar cada consulta</w:t>
+        <w:t xml:space="preserve">Qué entra en el resultado</w:t>
       </w:r>
     </w:p>
     <w:tbl>
@@ -2421,7 +2456,7 @@
                 <w:b w:val="1"/>
                 <w:bCs w:val="1"/>
               </w:rPr>
-              <w:t xml:space="preserve">Pantalla</w:t>
+              <w:t xml:space="preserve">Si el texto está en…</w:t>
             </w:r>
           </w:p>
         </w:tc>
@@ -2441,7 +2476,7 @@
                 <w:b w:val="1"/>
                 <w:bCs w:val="1"/>
               </w:rPr>
-              <w:t xml:space="preserve">Cuándo conviene</w:t>
+              <w:t xml:space="preserve">Qué fila aparece</w:t>
             </w:r>
           </w:p>
         </w:tc>
@@ -2461,109 +2496,109 @@
                 <w:b w:val="1"/>
                 <w:bCs w:val="1"/>
               </w:rPr>
-              <w:t xml:space="preserve">Qué va a ver</w:t>
-            </w:r>
-          </w:p>
-        </w:tc>
-      </w:tr>
-      <w:tr>
-        <w:trPr/>
-        <w:tc>
-          <w:tcPr>
-            <w:tcW w:w="2800" w:type="dxa"/>
-            <w:noWrap/>
-          </w:tcPr>
-          <w:p>
-            <w:pPr/>
-            <w:r>
-              <w:rPr>
-                <w:sz w:val="20"/>
-                <w:szCs w:val="20"/>
-              </w:rPr>
-              <w:t xml:space="preserve">VIP Emita por nombre</w:t>
-            </w:r>
-          </w:p>
-        </w:tc>
-        <w:tc>
-          <w:tcPr>
-            <w:tcW w:w="2800" w:type="dxa"/>
-            <w:noWrap/>
-          </w:tcPr>
-          <w:p>
-            <w:pPr/>
-            <w:r>
-              <w:rPr>
-                <w:sz w:val="20"/>
-                <w:szCs w:val="20"/>
-              </w:rPr>
-              <w:t xml:space="preserve">Sabe el nombre, el apellido o un apodo de alguien que ya tiene cuenta de juego</w:t>
-            </w:r>
-          </w:p>
-        </w:tc>
-        <w:tc>
-          <w:tcPr>
-            <w:tcW w:w="2800" w:type="dxa"/>
-            <w:noWrap/>
-          </w:tcPr>
-          <w:p>
-            <w:pPr/>
-            <w:r>
-              <w:rPr>
-                <w:sz w:val="20"/>
-                <w:szCs w:val="20"/>
-              </w:rPr>
-              <w:t xml:space="preserve">Solo cuentas con nombre y con fecha de última visita. El texto puede estar en el nombre o en el apodo.</w:t>
-            </w:r>
-          </w:p>
-        </w:tc>
-      </w:tr>
-      <w:tr>
-        <w:trPr/>
-        <w:tc>
-          <w:tcPr>
-            <w:tcW w:w="2800" w:type="dxa"/>
-            <w:noWrap/>
-          </w:tcPr>
-          <w:p>
-            <w:pPr/>
-            <w:r>
-              <w:rPr>
-                <w:sz w:val="20"/>
-                <w:szCs w:val="20"/>
-              </w:rPr>
-              <w:t xml:space="preserve">VIP Emita por alias</w:t>
-            </w:r>
-          </w:p>
-        </w:tc>
-        <w:tc>
-          <w:tcPr>
-            <w:tcW w:w="2800" w:type="dxa"/>
-            <w:noWrap/>
-          </w:tcPr>
-          <w:p>
-            <w:pPr/>
-            <w:r>
-              <w:rPr>
-                <w:sz w:val="20"/>
-                <w:szCs w:val="20"/>
-              </w:rPr>
-              <w:t xml:space="preserve">Solo conoce el apodo, o quiere ver apodos que todavía no tienen cuenta</w:t>
-            </w:r>
-          </w:p>
-        </w:tc>
-        <w:tc>
-          <w:tcPr>
-            <w:tcW w:w="2800" w:type="dxa"/>
-            <w:noWrap/>
-          </w:tcPr>
-          <w:p>
-            <w:pPr/>
-            <w:r>
-              <w:rPr>
-                <w:sz w:val="20"/>
-                <w:szCs w:val="20"/>
-              </w:rPr>
-              <w:t xml:space="preserve">Cuentas con apodo y, al final, apodos sueltos (sin cuenta). Esos apodos sueltos también tienen que tener una visita registrada.</w:t>
+              <w:t xml:space="preserve">Se puede usar en un canje</w:t>
+            </w:r>
+          </w:p>
+        </w:tc>
+      </w:tr>
+      <w:tr>
+        <w:trPr/>
+        <w:tc>
+          <w:tcPr>
+            <w:tcW w:w="2800" w:type="dxa"/>
+            <w:noWrap/>
+          </w:tcPr>
+          <w:p>
+            <w:pPr/>
+            <w:r>
+              <w:rPr>
+                <w:sz w:val="20"/>
+                <w:szCs w:val="20"/>
+              </w:rPr>
+              <w:t xml:space="preserve">El nombre o el alias de una cuenta Wigos</w:t>
+            </w:r>
+          </w:p>
+        </w:tc>
+        <w:tc>
+          <w:tcPr>
+            <w:tcW w:w="2800" w:type="dxa"/>
+            <w:noWrap/>
+          </w:tcPr>
+          <w:p>
+            <w:pPr/>
+            <w:r>
+              <w:rPr>
+                <w:sz w:val="20"/>
+                <w:szCs w:val="20"/>
+              </w:rPr>
+              <w:t xml:space="preserve">Origen Wigos, con número de cuenta, nombre y última visita. La cuenta tiene que tener alias.</w:t>
+            </w:r>
+          </w:p>
+        </w:tc>
+        <w:tc>
+          <w:tcPr>
+            <w:tcW w:w="2800" w:type="dxa"/>
+            <w:noWrap/>
+          </w:tcPr>
+          <w:p>
+            <w:pPr/>
+            <w:r>
+              <w:rPr>
+                <w:sz w:val="20"/>
+                <w:szCs w:val="20"/>
+              </w:rPr>
+              <w:t xml:space="preserve">Sí, con el botón Elegir en el facturador</w:t>
+            </w:r>
+          </w:p>
+        </w:tc>
+      </w:tr>
+      <w:tr>
+        <w:trPr/>
+        <w:tc>
+          <w:tcPr>
+            <w:tcW w:w="2800" w:type="dxa"/>
+            <w:noWrap/>
+          </w:tcPr>
+          <w:p>
+            <w:pPr/>
+            <w:r>
+              <w:rPr>
+                <w:sz w:val="20"/>
+                <w:szCs w:val="20"/>
+              </w:rPr>
+              <w:t xml:space="preserve">Un apodo que todavía no tiene cuenta</w:t>
+            </w:r>
+          </w:p>
+        </w:tc>
+        <w:tc>
+          <w:tcPr>
+            <w:tcW w:w="2800" w:type="dxa"/>
+            <w:noWrap/>
+          </w:tcPr>
+          <w:p>
+            <w:pPr/>
+            <w:r>
+              <w:rPr>
+                <w:sz w:val="20"/>
+                <w:szCs w:val="20"/>
+              </w:rPr>
+              <w:t xml:space="preserve">Origen Solo alias, al final de la lista, sin número de cuenta. También tiene que tener una visita.</w:t>
+            </w:r>
+          </w:p>
+        </w:tc>
+        <w:tc>
+          <w:tcPr>
+            <w:tcW w:w="2800" w:type="dxa"/>
+            <w:noWrap/>
+          </w:tcPr>
+          <w:p>
+            <w:pPr/>
+            <w:r>
+              <w:rPr>
+                <w:sz w:val="20"/>
+                <w:szCs w:val="20"/>
+              </w:rPr>
+              <w:t xml:space="preserve">No. Se ve, pero no tiene Elegir</w:t>
             </w:r>
           </w:p>
         </w:tc>
@@ -2590,7 +2625,7 @@
           <w:sz w:val="22"/>
           <w:szCs w:val="22"/>
         </w:rPr>
-        <w:t xml:space="preserve">En el facturador, dentro del recuadro Descuento y cliente VIP, hay dos botones azules: Por nombre y Por alias. Abren la misma búsqueda del capítulo 8, pero desde ahí puede elegir a la persona para el canje.</w:t>
+        <w:t xml:space="preserve">En el facturador, dentro del recuadro Descuento y cliente VIP, hay un solo botón: Consultar Emita. Ya no están Por nombre y Por alias. Abre la misma búsqueda del capítulo 8.</w:t>
       </w:r>
     </w:p>
     <w:p>
@@ -2616,7 +2651,7 @@
           <w:sz w:val="22"/>
           <w:szCs w:val="22"/>
         </w:rPr>
-        <w:t xml:space="preserve">Cuando encuentre a la persona correcta, pulse Elegir en esa fila. El nombre queda cargado como cliente VIP y puede seguir con F8.</w:t>
+        <w:t xml:space="preserve">En cada fila con cuenta de Wigos y nombre aparece el botón Elegir. Al pulsarlo, esa persona queda como cliente VIP del canje y puede seguir con F8.</w:t>
       </w:r>
     </w:p>
     <w:p>
@@ -2653,7 +2688,7 @@
       </w:pPr>
       <w:r>
         <w:rPr/>
-        <w:t xml:space="preserve">La lupa de al lado del nombre sigue buscando la lista de Anita. Los botones Por nombre y Por alias son los únicos que van a Emita.</w:t>
+        <w:t xml:space="preserve">La lupa de al lado del nombre sigue buscando la lista de Anita. Consultar Emita es el único botón que va a Emita.</w:t>
       </w:r>
     </w:p>
     <w:p>
@@ -3680,7 +3715,7 @@
                 <w:sz w:val="20"/>
                 <w:szCs w:val="20"/>
               </w:rPr>
-              <w:t xml:space="preserve">Probar la lupa de Anita, o Por nombre / Por alias en Emita</w:t>
+              <w:t xml:space="preserve">Probar la lupa de Anita, o Consultar Emita</w:t>
             </w:r>
           </w:p>
         </w:tc>
@@ -3977,7 +4012,7 @@
       </w:pPr>
       <w:r>
         <w:rPr/>
-        <w:t xml:space="preserve">Indique quién lo recibe: código, DNI, lupa de Anita, tarjeta, o Por nombre / Por alias si hay que buscarlo en Emita.</w:t>
+        <w:t xml:space="preserve">Indique quién lo recibe: código, DNI, lupa de Anita, tarjeta, o Consultar Emita si hay que buscarlo por nombre o por alias.</w:t>
       </w:r>
     </w:p>
     <w:p>

</xml_diff>